<commit_message>
Update final report documents
</commit_message>
<xml_diff>
--- a/dokumen/Laporan capstone-a05.docx
+++ b/dokumen/Laporan capstone-a05.docx
@@ -563,10 +563,7 @@
       </w:r>
       <w:proofErr w:type="spellEnd"/>
       <w:r>
-        <w:t xml:space="preserve"> valid</w:t>
-      </w:r>
-      <w:r>
-        <w:t>.</w:t>
+        <w:t xml:space="preserve"> valid.</w:t>
       </w:r>
     </w:p>
     <w:p>
@@ -921,12 +918,6 @@
         <w:gridCol w:w="3661"/>
       </w:tblGrid>
       <w:tr>
-        <w:tblPrEx>
-          <w:tblCellMar>
-            <w:top w:w="0" w:type="dxa"/>
-            <w:bottom w:w="0" w:type="dxa"/>
-          </w:tblCellMar>
-        </w:tblPrEx>
         <w:trPr>
           <w:tblHeader/>
         </w:trPr>
@@ -1132,28 +1123,13 @@
                 <w:sz w:val="18"/>
                 <w:szCs w:val="18"/>
               </w:rPr>
-              <w:t>tamba</w:t>
-            </w:r>
-            <w:r>
-              <w:rPr>
-                <w:b/>
-                <w:bCs/>
-                <w:sz w:val="18"/>
-                <w:szCs w:val="18"/>
-              </w:rPr>
-              <w:t>han</w:t>
+              <w:t>tambahan</w:t>
             </w:r>
             <w:proofErr w:type="spellEnd"/>
           </w:p>
         </w:tc>
       </w:tr>
       <w:tr>
-        <w:tblPrEx>
-          <w:tblCellMar>
-            <w:top w:w="0" w:type="dxa"/>
-            <w:bottom w:w="0" w:type="dxa"/>
-          </w:tblCellMar>
-        </w:tblPrEx>
         <w:trPr>
           <w:cantSplit/>
         </w:trPr>
@@ -1341,12 +1317,6 @@
         </w:tc>
       </w:tr>
       <w:tr>
-        <w:tblPrEx>
-          <w:tblCellMar>
-            <w:top w:w="0" w:type="dxa"/>
-            <w:bottom w:w="0" w:type="dxa"/>
-          </w:tblCellMar>
-        </w:tblPrEx>
         <w:trPr>
           <w:cantSplit/>
         </w:trPr>
@@ -1565,12 +1535,6 @@
         </w:tc>
       </w:tr>
       <w:tr>
-        <w:tblPrEx>
-          <w:tblCellMar>
-            <w:top w:w="0" w:type="dxa"/>
-            <w:bottom w:w="0" w:type="dxa"/>
-          </w:tblCellMar>
-        </w:tblPrEx>
         <w:trPr>
           <w:cantSplit/>
         </w:trPr>
@@ -1764,12 +1728,6 @@
         </w:tc>
       </w:tr>
       <w:tr>
-        <w:tblPrEx>
-          <w:tblCellMar>
-            <w:top w:w="0" w:type="dxa"/>
-            <w:bottom w:w="0" w:type="dxa"/>
-          </w:tblCellMar>
-        </w:tblPrEx>
         <w:trPr>
           <w:cantSplit/>
         </w:trPr>
@@ -2140,6 +2098,11 @@
         <w:shd w:val="clear" w:color="auto" w:fill="F2F4F5"/>
         <w:spacing w:after="160"/>
         <w:ind w:left="120" w:right="120"/>
+        <w:rPr>
+          <w:rFonts w:ascii="Courier New" w:eastAsia="Courier New" w:hAnsi="Courier New" w:cs="Courier New"/>
+          <w:sz w:val="17"/>
+          <w:szCs w:val="17"/>
+        </w:rPr>
       </w:pPr>
       <w:proofErr w:type="spellStart"/>
       <w:r>
@@ -3246,13 +3209,225 @@
     </w:p>
     <w:p>
       <w:pPr>
+        <w:pStyle w:val="ListParagraph"/>
+        <w:spacing w:after="120"/>
+        <w:ind w:left="720" w:firstLine="720"/>
+      </w:pPr>
+      <w:r>
+        <w:rPr>
+          <w:noProof/>
+        </w:rPr>
+        <w:drawing>
+          <wp:anchor distT="0" distB="0" distL="114300" distR="114300" simplePos="0" relativeHeight="251658240" behindDoc="0" locked="0" layoutInCell="1" allowOverlap="1" wp14:anchorId="61710AED" wp14:editId="31BED00D">
+            <wp:simplePos x="0" y="0"/>
+            <wp:positionH relativeFrom="column">
+              <wp:posOffset>-78740</wp:posOffset>
+            </wp:positionH>
+            <wp:positionV relativeFrom="paragraph">
+              <wp:posOffset>254337</wp:posOffset>
+            </wp:positionV>
+            <wp:extent cx="6342380" cy="4227195"/>
+            <wp:effectExtent l="0" t="0" r="1270" b="1905"/>
+            <wp:wrapNone/>
+            <wp:docPr id="1" name="Picture 1"/>
+            <wp:cNvGraphicFramePr>
+              <a:graphicFrameLocks xmlns:a="http://schemas.openxmlformats.org/drawingml/2006/main" noChangeAspect="1"/>
+            </wp:cNvGraphicFramePr>
+            <a:graphic xmlns:a="http://schemas.openxmlformats.org/drawingml/2006/main">
+              <a:graphicData uri="http://schemas.openxmlformats.org/drawingml/2006/picture">
+                <pic:pic xmlns:pic="http://schemas.openxmlformats.org/drawingml/2006/picture">
+                  <pic:nvPicPr>
+                    <pic:cNvPr id="0" name="Picture 1"/>
+                    <pic:cNvPicPr>
+                      <a:picLocks noChangeAspect="1" noChangeArrowheads="1"/>
+                    </pic:cNvPicPr>
+                  </pic:nvPicPr>
+                  <pic:blipFill>
+                    <a:blip r:embed="rId7" cstate="print">
+                      <a:extLst>
+                        <a:ext uri="{28A0092B-C50C-407E-A947-70E740481C1C}">
+                          <a14:useLocalDpi xmlns:a14="http://schemas.microsoft.com/office/drawing/2010/main" val="0"/>
+                        </a:ext>
+                      </a:extLst>
+                    </a:blip>
+                    <a:srcRect/>
+                    <a:stretch>
+                      <a:fillRect/>
+                    </a:stretch>
+                  </pic:blipFill>
+                  <pic:spPr bwMode="auto">
+                    <a:xfrm>
+                      <a:off x="0" y="0"/>
+                      <a:ext cx="6342380" cy="4227195"/>
+                    </a:xfrm>
+                    <a:prstGeom prst="rect">
+                      <a:avLst/>
+                    </a:prstGeom>
+                    <a:noFill/>
+                    <a:ln>
+                      <a:noFill/>
+                    </a:ln>
+                  </pic:spPr>
+                </pic:pic>
+              </a:graphicData>
+            </a:graphic>
+            <wp14:sizeRelH relativeFrom="margin">
+              <wp14:pctWidth>0</wp14:pctWidth>
+            </wp14:sizeRelH>
+            <wp14:sizeRelV relativeFrom="margin">
+              <wp14:pctHeight>0</wp14:pctHeight>
+            </wp14:sizeRelV>
+          </wp:anchor>
+        </w:drawing>
+      </w:r>
+    </w:p>
+    <w:p>
+      <w:pPr>
+        <w:pStyle w:val="ListParagraph"/>
+        <w:spacing w:after="120"/>
+        <w:ind w:left="720" w:firstLine="720"/>
+      </w:pPr>
+    </w:p>
+    <w:p>
+      <w:pPr>
+        <w:pStyle w:val="ListParagraph"/>
+        <w:spacing w:after="120"/>
+        <w:ind w:left="720" w:firstLine="720"/>
+      </w:pPr>
+    </w:p>
+    <w:p>
+      <w:pPr>
+        <w:pStyle w:val="ListParagraph"/>
+        <w:spacing w:after="120"/>
+        <w:ind w:left="720" w:firstLine="720"/>
+      </w:pPr>
+    </w:p>
+    <w:p>
+      <w:pPr>
+        <w:pStyle w:val="ListParagraph"/>
+        <w:spacing w:after="120"/>
+        <w:ind w:left="720" w:firstLine="720"/>
+      </w:pPr>
+    </w:p>
+    <w:p>
+      <w:pPr>
+        <w:pStyle w:val="ListParagraph"/>
+        <w:spacing w:after="120"/>
+        <w:ind w:left="720" w:firstLine="720"/>
+      </w:pPr>
+    </w:p>
+    <w:p>
+      <w:pPr>
+        <w:pStyle w:val="ListParagraph"/>
+        <w:spacing w:after="120"/>
+        <w:ind w:left="720" w:firstLine="720"/>
+      </w:pPr>
+    </w:p>
+    <w:p>
+      <w:pPr>
+        <w:pStyle w:val="ListParagraph"/>
+        <w:spacing w:after="120"/>
+        <w:ind w:left="720" w:firstLine="720"/>
+      </w:pPr>
+    </w:p>
+    <w:p>
+      <w:pPr>
+        <w:pStyle w:val="ListParagraph"/>
+        <w:spacing w:after="120"/>
+        <w:ind w:left="720" w:firstLine="720"/>
+      </w:pPr>
+    </w:p>
+    <w:p>
+      <w:pPr>
+        <w:pStyle w:val="ListParagraph"/>
+        <w:spacing w:after="120"/>
+        <w:ind w:left="720" w:firstLine="720"/>
+      </w:pPr>
+    </w:p>
+    <w:p>
+      <w:pPr>
+        <w:pStyle w:val="ListParagraph"/>
+        <w:spacing w:after="120"/>
+        <w:ind w:left="720" w:firstLine="720"/>
+      </w:pPr>
+    </w:p>
+    <w:p>
+      <w:pPr>
+        <w:pStyle w:val="ListParagraph"/>
+        <w:spacing w:after="120"/>
+        <w:ind w:left="720" w:firstLine="720"/>
+      </w:pPr>
+    </w:p>
+    <w:p>
+      <w:pPr>
+        <w:pStyle w:val="ListParagraph"/>
+        <w:spacing w:after="120"/>
+        <w:ind w:left="720" w:firstLine="720"/>
+      </w:pPr>
+    </w:p>
+    <w:p>
+      <w:pPr>
+        <w:pStyle w:val="ListParagraph"/>
+        <w:spacing w:after="120"/>
+        <w:ind w:left="720" w:firstLine="720"/>
+      </w:pPr>
+    </w:p>
+    <w:p>
+      <w:pPr>
+        <w:pStyle w:val="ListParagraph"/>
+        <w:spacing w:after="120"/>
+        <w:ind w:left="720" w:firstLine="720"/>
+      </w:pPr>
+    </w:p>
+    <w:p>
+      <w:pPr>
+        <w:pStyle w:val="ListParagraph"/>
+        <w:spacing w:after="120"/>
+        <w:ind w:left="720" w:firstLine="720"/>
+      </w:pPr>
+    </w:p>
+    <w:p>
+      <w:pPr>
+        <w:pStyle w:val="ListParagraph"/>
+        <w:spacing w:after="120"/>
+        <w:ind w:left="720" w:firstLine="720"/>
+      </w:pPr>
+    </w:p>
+    <w:p>
+      <w:pPr>
+        <w:pStyle w:val="ListParagraph"/>
+        <w:spacing w:after="120"/>
+        <w:ind w:left="720" w:firstLine="720"/>
+      </w:pPr>
+    </w:p>
+    <w:p>
+      <w:pPr>
+        <w:pStyle w:val="ListParagraph"/>
+        <w:spacing w:after="120"/>
+        <w:ind w:left="720" w:firstLine="720"/>
+      </w:pPr>
+    </w:p>
+    <w:p>
+      <w:pPr>
+        <w:pStyle w:val="ListParagraph"/>
+        <w:spacing w:after="120"/>
+        <w:ind w:left="720" w:firstLine="720"/>
+      </w:pPr>
+    </w:p>
+    <w:p>
+      <w:pPr>
+        <w:pStyle w:val="ListParagraph"/>
+        <w:spacing w:after="120"/>
+        <w:ind w:left="720" w:firstLine="720"/>
+      </w:pPr>
+    </w:p>
+    <w:p>
+      <w:pPr>
         <w:pStyle w:val="Heading1"/>
       </w:pPr>
       <w:r>
-        <w:t>3</w:t>
-      </w:r>
-      <w:r>
-        <w:t xml:space="preserve">. Hasil </w:t>
+        <w:lastRenderedPageBreak/>
+        <w:t xml:space="preserve">3. Hasil </w:t>
       </w:r>
       <w:proofErr w:type="spellStart"/>
       <w:r>
@@ -3272,17 +3447,8 @@
           <w:b/>
           <w:bCs/>
         </w:rPr>
-        <w:t xml:space="preserve">U1 - Normal </w:t>
-      </w:r>
-      <w:proofErr w:type="spellStart"/>
-      <w:r>
-        <w:rPr>
-          <w:b/>
-          <w:bCs/>
-        </w:rPr>
-        <w:t>Processing</w:t>
-      </w:r>
-      <w:proofErr w:type="spellEnd"/>
+        <w:t>U1 - Normal Processing</w:t>
+      </w:r>
     </w:p>
     <w:p>
       <w:pPr>
@@ -4275,14 +4441,23 @@
       <w:pPr>
         <w:spacing w:after="120"/>
         <w:jc w:val="both"/>
-      </w:pPr>
-      <w:r>
         <w:rPr>
           <w:b/>
           <w:bCs/>
         </w:rPr>
-        <w:lastRenderedPageBreak/>
-        <w:t>### U4 - Invalid dan Valid Message</w:t>
+      </w:pPr>
+    </w:p>
+    <w:p>
+      <w:pPr>
+        <w:spacing w:after="120"/>
+        <w:jc w:val="both"/>
+      </w:pPr>
+      <w:r>
+        <w:rPr>
+          <w:b/>
+          <w:bCs/>
+        </w:rPr>
+        <w:t>U4 - Invalid dan Valid Message</w:t>
       </w:r>
     </w:p>
     <w:p>
@@ -4652,11 +4827,36 @@
         <w:spacing w:after="120"/>
         <w:jc w:val="both"/>
       </w:pPr>
+    </w:p>
+    <w:p>
+      <w:pPr>
+        <w:spacing w:after="120"/>
+        <w:jc w:val="both"/>
+      </w:pPr>
+    </w:p>
+    <w:p>
+      <w:pPr>
+        <w:spacing w:after="120"/>
+        <w:jc w:val="both"/>
+      </w:pPr>
+    </w:p>
+    <w:p>
+      <w:pPr>
+        <w:spacing w:after="120"/>
+        <w:jc w:val="both"/>
+      </w:pPr>
+    </w:p>
+    <w:p>
+      <w:pPr>
+        <w:spacing w:after="120"/>
+        <w:jc w:val="both"/>
+      </w:pPr>
       <w:r>
         <w:rPr>
           <w:b/>
           <w:bCs/>
         </w:rPr>
+        <w:lastRenderedPageBreak/>
         <w:t xml:space="preserve">### </w:t>
       </w:r>
       <w:proofErr w:type="spellStart"/>
@@ -5332,36 +5532,19 @@
     </w:p>
     <w:p>
       <w:pPr>
+        <w:pStyle w:val="ListParagraph"/>
+        <w:spacing w:after="120"/>
+        <w:ind w:left="720"/>
+        <w:jc w:val="both"/>
+      </w:pPr>
+    </w:p>
+    <w:p>
+      <w:pPr>
         <w:spacing w:after="120"/>
         <w:jc w:val="both"/>
       </w:pPr>
-    </w:p>
-    <w:p>
-      <w:pPr>
-        <w:spacing w:after="120"/>
-        <w:jc w:val="both"/>
-      </w:pPr>
-    </w:p>
-    <w:p>
-      <w:pPr>
-        <w:spacing w:after="120"/>
-        <w:jc w:val="both"/>
-      </w:pPr>
-    </w:p>
-    <w:p>
-      <w:pPr>
-        <w:spacing w:after="120"/>
-        <w:jc w:val="both"/>
-      </w:pPr>
-    </w:p>
-    <w:p>
-      <w:pPr>
-        <w:spacing w:after="120"/>
-        <w:jc w:val="both"/>
-      </w:pPr>
-      <w:proofErr w:type="spellStart"/>
-      <w:r>
-        <w:lastRenderedPageBreak/>
+      <w:proofErr w:type="spellStart"/>
+      <w:r>
         <w:t>Pemulihan</w:t>
       </w:r>
       <w:proofErr w:type="spellEnd"/>
@@ -5749,14 +5932,12 @@
         <w:pStyle w:val="Heading1"/>
       </w:pPr>
       <w:r>
+        <w:lastRenderedPageBreak/>
         <w:t xml:space="preserve">5. Batas </w:t>
       </w:r>
       <w:proofErr w:type="spellStart"/>
       <w:r>
-        <w:t>prot</w:t>
-      </w:r>
-      <w:r>
-        <w:t>otipe</w:t>
+        <w:t>prototipe</w:t>
       </w:r>
       <w:proofErr w:type="spellEnd"/>
     </w:p>
@@ -6541,12 +6722,6 @@
         <w:gridCol w:w="7352"/>
       </w:tblGrid>
       <w:tr>
-        <w:tblPrEx>
-          <w:tblCellMar>
-            <w:top w:w="0" w:type="dxa"/>
-            <w:bottom w:w="0" w:type="dxa"/>
-          </w:tblCellMar>
-        </w:tblPrEx>
         <w:trPr>
           <w:tblHeader/>
         </w:trPr>
@@ -6614,12 +6789,6 @@
         </w:tc>
       </w:tr>
       <w:tr>
-        <w:tblPrEx>
-          <w:tblCellMar>
-            <w:top w:w="0" w:type="dxa"/>
-            <w:bottom w:w="0" w:type="dxa"/>
-          </w:tblCellMar>
-        </w:tblPrEx>
         <w:trPr>
           <w:cantSplit/>
         </w:trPr>
@@ -6768,12 +6937,6 @@
         </w:tc>
       </w:tr>
       <w:tr>
-        <w:tblPrEx>
-          <w:tblCellMar>
-            <w:top w:w="0" w:type="dxa"/>
-            <w:bottom w:w="0" w:type="dxa"/>
-          </w:tblCellMar>
-        </w:tblPrEx>
         <w:trPr>
           <w:cantSplit/>
         </w:trPr>
@@ -6952,12 +7115,6 @@
         </w:tc>
       </w:tr>
       <w:tr>
-        <w:tblPrEx>
-          <w:tblCellMar>
-            <w:top w:w="0" w:type="dxa"/>
-            <w:bottom w:w="0" w:type="dxa"/>
-          </w:tblCellMar>
-        </w:tblPrEx>
         <w:trPr>
           <w:cantSplit/>
         </w:trPr>
@@ -7106,12 +7263,6 @@
         </w:tc>
       </w:tr>
       <w:tr>
-        <w:tblPrEx>
-          <w:tblCellMar>
-            <w:top w:w="0" w:type="dxa"/>
-            <w:bottom w:w="0" w:type="dxa"/>
-          </w:tblCellMar>
-        </w:tblPrEx>
         <w:trPr>
           <w:cantSplit/>
         </w:trPr>
@@ -7228,13 +7379,7 @@
       </w:pPr>
       <w:r>
         <w:lastRenderedPageBreak/>
-        <w:t>7</w:t>
-      </w:r>
-      <w:r>
-        <w:t xml:space="preserve">. </w:t>
-      </w:r>
-      <w:r>
-        <w:t>Lampiran Bukti</w:t>
+        <w:t>7. Lampiran Bukti</w:t>
       </w:r>
     </w:p>
     <w:p>
@@ -8182,7 +8327,7 @@
       </w:pPr>
     </w:p>
     <w:sectPr>
-      <w:footerReference w:type="default" r:id="rId7"/>
+      <w:footerReference w:type="default" r:id="rId8"/>
       <w:pgSz w:w="11906" w:h="16838"/>
       <w:pgMar w:top="1134" w:right="1134" w:bottom="1134" w:left="1134" w:header="708" w:footer="708" w:gutter="0"/>
       <w:cols w:space="720"/>
@@ -9323,6 +9468,7 @@
   <w:style w:type="character" w:default="1" w:styleId="DefaultParagraphFont">
     <w:name w:val="Default Paragraph Font"/>
     <w:uiPriority w:val="1"/>
+    <w:semiHidden/>
     <w:unhideWhenUsed/>
   </w:style>
   <w:style w:type="table" w:default="1" w:styleId="TableNormal">

</xml_diff>